<commit_message>
Add contact info to Client User Guide and Feedback form
</commit_message>
<xml_diff>
--- a/product-templates/Newtree_Client_User_Guide.docx
+++ b/product-templates/Newtree_Client_User_Guide.docx
@@ -982,18 +982,7 @@
                 <w:sz w:val="19"/>
                 <w:szCs w:val="19"/>
               </w:rPr>
-              <w:t>“</w:t>
-            </w:r>
-            <w:r>
-              <w:rPr>
-                <w:rFonts w:eastAsia="Calibri" w:cs="Calibri" w:ascii="Calibri" w:hAnsi="Calibri"/>
-                <w:b w:val="false"/>
-                <w:bCs w:val="false"/>
-                <w:color w:val="222222"/>
-                <w:sz w:val="19"/>
-                <w:szCs w:val="19"/>
-              </w:rPr>
-              <w:t>Comparable sales” — recent sales of similar nearby properties, used to estimate value.</w:t>
+              <w:t>“Comparable sales” — recent sales of similar nearby properties, used to estimate value.</w:t>
             </w:r>
           </w:p>
         </w:tc>
@@ -1127,7 +1116,7 @@
           <w:sz w:val="21"/>
           <w:szCs w:val="21"/>
         </w:rPr>
-        <w:t>If anything in the report or spreadsheet is unclear, or you'd like a deeper look at a specific number, reach out — [contact info]. As a beta participant, your feedback also directly shapes what this service looks like going forward; we'll follow up separately to hear how it went.</w:t>
+        <w:t>If anything in the report or spreadsheet is unclear, or you'd like a deeper look at a specific number, reach out — harold@newtree-capital.net or 707-502-2191. As a beta participant, your feedback also directly shapes what this service looks like going forward; we'll follow up separately to hear how it went.</w:t>
       </w:r>
     </w:p>
     <w:sectPr>

</xml_diff>